<commit_message>
docs: adjust workload allocation to 25 and 18.75 percent
</commit_message>
<xml_diff>
--- a/docs/deliverables/下午班-08组-WEMOVE-SPORTS-分工与工作量报告-v1.1.docx
+++ b/docs/deliverables/下午班-08组-WEMOVE-SPORTS-分工与工作量报告-v1.1.docx
@@ -270,7 +270,7 @@
                 <w:color w:val="263746"/>
                 <w:sz w:val="18"/>
               </w:rPr>
-              <w:t>1/3（约 33.33%）</w:t>
+              <w:t>25%</w:t>
             </w:r>
           </w:p>
         </w:tc>
@@ -383,7 +383,7 @@
                 <w:color w:val="263746"/>
                 <w:sz w:val="18"/>
               </w:rPr>
-              <w:t>1/6（约 16.67%）</w:t>
+              <w:t>18.75%</w:t>
             </w:r>
           </w:p>
         </w:tc>
@@ -492,7 +492,7 @@
                 <w:color w:val="263746"/>
                 <w:sz w:val="18"/>
               </w:rPr>
-              <w:t>1/6（约 16.67%）</w:t>
+              <w:t>18.75%</w:t>
             </w:r>
           </w:p>
         </w:tc>
@@ -605,7 +605,7 @@
                 <w:color w:val="263746"/>
                 <w:sz w:val="18"/>
               </w:rPr>
-              <w:t>1/6（约 16.67%）</w:t>
+              <w:t>18.75%</w:t>
             </w:r>
           </w:p>
         </w:tc>
@@ -714,7 +714,7 @@
                 <w:color w:val="263746"/>
                 <w:sz w:val="18"/>
               </w:rPr>
-              <w:t>1/6（约 16.67%）</w:t>
+              <w:t>18.75%</w:t>
             </w:r>
           </w:p>
         </w:tc>
@@ -827,7 +827,7 @@
                 <w:color w:val="263746"/>
                 <w:sz w:val="18"/>
               </w:rPr>
-              <w:t>1（100%）</w:t>
+              <w:t>100%</w:t>
             </w:r>
           </w:p>
         </w:tc>
@@ -843,7 +843,7 @@
         <w:ind w:firstLine="420"/>
       </w:pPr>
       <w:r>
-        <w:t>比例按原六份工作包合并为“2+1+1+1+1”计算。分数为精确口径，显示百分比因四舍五入可能相差 0.01%。这是任务承接后的计划工作量；结项统计须依据实际代码、文档、评审、测试与演示证据确认，不当作已完成贡献。</w:t>
+        <w:t>计划工作量调整为甘文韬 25%，其余四人平分剩余 75%，各占 18.75%，合计 100%。各成员任务归属保持不变。这是任务承接后的计划工作量；结项统计须依据实际代码、文档、评审、测试与演示证据确认，不当作已完成贡献。</w:t>
       </w:r>
     </w:p>
     <w:p>

</xml_diff>

<commit_message>
docs: record actual team responsibilities and workload shares
</commit_message>
<xml_diff>
--- a/docs/deliverables/下午班-08组-WEMOVE-SPORTS-分工与工作量报告-v1.1.docx
+++ b/docs/deliverables/下午班-08组-WEMOVE-SPORTS-分工与工作量报告-v1.1.docx
@@ -15,7 +15,7 @@
         <w:ind w:firstLine="420"/>
       </w:pPr>
       <w:r>
-        <w:t>更新日期：2026-09-07。负责人：甘文韬。</w:t>
+        <w:t>更新日期：2026-09-08。负责人：甘文韬（学号：24150728）。</w:t>
       </w:r>
     </w:p>
     <w:p>
@@ -23,7 +23,7 @@
         <w:pStyle w:val="Heading2"/>
       </w:pPr>
       <w:r>
-        <w:t>调整后的任务分配</w:t>
+        <w:t>项目实际分工</w:t>
       </w:r>
     </w:p>
     <w:p>
@@ -161,7 +161,7 @@
                 <w:color w:val="FFFFFF"/>
                 <w:sz w:val="18"/>
               </w:rPr>
-              <w:t>计划工作量</w:t>
+              <w:t>实际工作量占比</w:t>
             </w:r>
           </w:p>
         </w:tc>
@@ -843,7 +843,7 @@
         <w:ind w:firstLine="420"/>
       </w:pPr>
       <w:r>
-        <w:t>计划工作量调整为甘文韬 25%，其余四人平分剩余 75%，各占 18.75%，合计 100%。各成员任务归属保持不变。这是任务承接后的计划工作量；结项统计须依据实际代码、文档、评审、测试与演示证据确认，不当作已完成贡献。</w:t>
+        <w:t>本项目实际工作量占比为甘文韬 25%，陈婧琳、周慧莹、倪依玲、龙祖怡各 18.75%，合计 100%。上表列明五名成员的实际职责和工作量占比。</w:t>
       </w:r>
     </w:p>
     <w:p>
@@ -1566,7 +1566,7 @@
         <w:pStyle w:val="Heading2"/>
       </w:pPr>
       <w:r>
-        <w:t>结项统计方式</w:t>
+        <w:t>实际工作量说明</w:t>
       </w:r>
     </w:p>
     <w:p>
@@ -1574,7 +1574,7 @@
         <w:ind w:firstLine="420"/>
       </w:pPr>
       <w:r>
-        <w:t>建议仍按开发联调 60%、文档 25%、协作演示 15% 归集证据。结项时逐人列出已完成任务及证据，另填写实际贡献比例和确认日期；确认前使用本表的计划比例安排工作。</w:t>
+        <w:t>团队实际分工与工作量占比按上表记录。成员职责包括开发联调、文档编写、测试验证及协作汇报，相关任务记录与成果见本报告及对应项目材料。</w:t>
       </w:r>
     </w:p>
     <w:sectPr>

</xml_diff>